<commit_message>
ADDING TODAY'S WORK - 03.09.2026
</commit_message>
<xml_diff>
--- a/viva/questions/viva_questions_plan.docx
+++ b/viva/questions/viva_questions_plan.docx
@@ -3071,23 +3071,7 @@
             <w:b/>
             <w:bCs/>
           </w:rPr>
-          <w:t>https://link.sprin</w:t>
-        </w:r>
-        <w:r>
-          <w:rPr>
-            <w:rStyle w:val="Hyperlink"/>
-            <w:b/>
-            <w:bCs/>
-          </w:rPr>
-          <w:t>g</w:t>
-        </w:r>
-        <w:r>
-          <w:rPr>
-            <w:rStyle w:val="Hyperlink"/>
-            <w:b/>
-            <w:bCs/>
-          </w:rPr>
-          <w:t>er.com/article/10.1007/s12016-022-08955-9</w:t>
+          <w:t>https://link.springer.com/article/10.1007/s12016-022-08955-9</w:t>
         </w:r>
       </w:hyperlink>
       <w:r>
@@ -3682,16 +3666,28 @@
           <w:ilvl w:val="0"/>
           <w:numId w:val="5"/>
         </w:numPr>
-      </w:pPr>
-      <w:r>
+        <w:rPr>
+          <w:strike/>
+        </w:rPr>
+      </w:pPr>
+      <w:r>
+        <w:rPr>
+          <w:strike/>
+        </w:rPr>
         <w:t>How do you know WNT/NOTCH/</w:t>
       </w:r>
       <w:proofErr w:type="spellStart"/>
       <w:r>
+        <w:rPr>
+          <w:strike/>
+        </w:rPr>
         <w:t>RHOGTPase</w:t>
       </w:r>
       <w:proofErr w:type="spellEnd"/>
       <w:r>
+        <w:rPr>
+          <w:strike/>
+        </w:rPr>
         <w:t xml:space="preserve"> pathways are involved in epithelial barrier homeostasis? </w:t>
       </w:r>
     </w:p>
@@ -4427,19 +4423,7 @@
           <w:rPr>
             <w:rStyle w:val="Hyperlink"/>
           </w:rPr>
-          <w:t>https://www.jove.com/t/68760/a-</w:t>
-        </w:r>
-        <w:r>
-          <w:rPr>
-            <w:rStyle w:val="Hyperlink"/>
-          </w:rPr>
-          <w:t>v</w:t>
-        </w:r>
-        <w:r>
-          <w:rPr>
-            <w:rStyle w:val="Hyperlink"/>
-          </w:rPr>
-          <w:t>erified-workflow-for-mirna-seq-data-processing-bioinformatics</w:t>
+          <w:t>https://www.jove.com/t/68760/a-verified-workflow-for-mirna-seq-data-processing-bioinformatics</w:t>
         </w:r>
       </w:hyperlink>
     </w:p>
@@ -4456,19 +4440,7 @@
           <w:rPr>
             <w:rStyle w:val="Hyperlink"/>
           </w:rPr>
-          <w:t>https://www.mdpi.com/1422-0067/23/3/1</w:t>
-        </w:r>
-        <w:r>
-          <w:rPr>
-            <w:rStyle w:val="Hyperlink"/>
-          </w:rPr>
-          <w:t>2</w:t>
-        </w:r>
-        <w:r>
-          <w:rPr>
-            <w:rStyle w:val="Hyperlink"/>
-          </w:rPr>
-          <w:t>26</w:t>
+          <w:t>https://www.mdpi.com/1422-0067/23/3/1226</w:t>
         </w:r>
       </w:hyperlink>
     </w:p>
@@ -4490,39 +4462,6 @@
           <w:bCs/>
         </w:rPr>
         <w:t>Found review papers that discussed methods and tools</w:t>
-      </w:r>
-    </w:p>
-    <w:p>
-      <w:pPr>
-        <w:pStyle w:val="ListParagraph"/>
-        <w:numPr>
-          <w:ilvl w:val="2"/>
-          <w:numId w:val="5"/>
-        </w:numPr>
-      </w:pPr>
-      <w:r>
-        <w:fldChar w:fldCharType="begin"/>
-      </w:r>
-      <w:r>
-        <w:instrText>HYPERLINK "</w:instrText>
-      </w:r>
-      <w:r>
-        <w:instrText>https://www.sciencedirect.com/science/article/pii/S0010482521003383</w:instrText>
-      </w:r>
-      <w:r>
-        <w:instrText>"</w:instrText>
-      </w:r>
-      <w:r>
-        <w:fldChar w:fldCharType="separate"/>
-      </w:r>
-      <w:r>
-        <w:rPr>
-          <w:rStyle w:val="Hyperlink"/>
-        </w:rPr>
-        <w:t>https://www.sciencedirect.com/science/article/pii/S0010482521003383</w:t>
-      </w:r>
-      <w:r>
-        <w:fldChar w:fldCharType="end"/>
       </w:r>
     </w:p>
     <w:p>
@@ -4538,19 +4477,24 @@
           <w:rPr>
             <w:rStyle w:val="Hyperlink"/>
           </w:rPr>
-          <w:t>https://pmc.ncbi.nlm.</w:t>
+          <w:t>https://www.sciencedirect.com/science/article/pii/S0010482521003383</w:t>
         </w:r>
+      </w:hyperlink>
+    </w:p>
+    <w:p>
+      <w:pPr>
+        <w:pStyle w:val="ListParagraph"/>
+        <w:numPr>
+          <w:ilvl w:val="2"/>
+          <w:numId w:val="5"/>
+        </w:numPr>
+      </w:pPr>
+      <w:hyperlink r:id="rId14" w:history="1">
         <w:r>
           <w:rPr>
             <w:rStyle w:val="Hyperlink"/>
           </w:rPr>
-          <w:t>n</w:t>
-        </w:r>
-        <w:r>
-          <w:rPr>
-            <w:rStyle w:val="Hyperlink"/>
-          </w:rPr>
-          <w:t>ih.gov/articles/PMC10951429/</w:t>
+          <w:t>https://pmc.ncbi.nlm.nih.gov/articles/PMC10951429/</w:t>
         </w:r>
       </w:hyperlink>
     </w:p>
@@ -4562,7 +4506,7 @@
           <w:numId w:val="5"/>
         </w:numPr>
       </w:pPr>
-      <w:hyperlink r:id="rId14" w:history="1">
+      <w:hyperlink r:id="rId15" w:history="1">
         <w:r>
           <w:rPr>
             <w:rStyle w:val="Hyperlink"/>
@@ -4595,7 +4539,7 @@
           <w:numId w:val="5"/>
         </w:numPr>
       </w:pPr>
-      <w:hyperlink r:id="rId15" w:history="1">
+      <w:hyperlink r:id="rId16" w:history="1">
         <w:r>
           <w:rPr>
             <w:rStyle w:val="Hyperlink"/>
@@ -4732,7 +4676,7 @@
         </w:rPr>
         <w:t xml:space="preserve">(nose reacts to allergens) </w:t>
       </w:r>
-      <w:hyperlink r:id="rId16" w:history="1">
+      <w:hyperlink r:id="rId17" w:history="1">
         <w:r>
           <w:rPr>
             <w:rStyle w:val="Hyperlink"/>
@@ -4796,7 +4740,7 @@
         </w:rPr>
         <w:t xml:space="preserve">suggests miRNAs may be involved in explaining the “higher susceptibility of females to asthma” </w:t>
       </w:r>
-      <w:hyperlink r:id="rId17" w:history="1">
+      <w:hyperlink r:id="rId18" w:history="1">
         <w:r>
           <w:rPr>
             <w:rStyle w:val="Hyperlink"/>
@@ -5325,7 +5269,7 @@
         </w:rPr>
         <w:t xml:space="preserve">Mimics and inhibitors were used in previous studies </w:t>
       </w:r>
-      <w:hyperlink r:id="rId18" w:history="1">
+      <w:hyperlink r:id="rId19" w:history="1">
         <w:r>
           <w:rPr>
             <w:rStyle w:val="Hyperlink"/>

</xml_diff>